<commit_message>
Publica v1.0.4: atualização incremental e formatação obrigatória dos blocos
Acrescenta atualização por arquivos alterados, verificação de integridade e reinício com recuperação da versão anterior. Organiza o aplicativo por versões e substitui o iniciador antigo pela entrada aplicativo.py.

Aplica as margens do modelo a todas as seções. Garante títulos e numeração em negrito, subtítulos com primeira linha de 1 cm e endereçamento/processo em negrito e caixa alta visual, preservando conteúdo e timbre. Atualiza modelo, catálogo, auditoria e regressões.

Validação: 117 testes aprovados; conferência visual no Word; executável local aprovado em DOCX, Markdown, interface, timbre, margens, estilos e atualização com reinício. A migração da versão 1.0.3 requer instalar a 1.0.4 uma vez.
</commit_message>
<xml_diff>
--- a/modelos/modelo_oficial.docx
+++ b/modelos/modelo_oficial.docx
@@ -715,20 +715,31 @@
     <w:lvl w:ilvl="0" w:tplc="04160013">
       <w:start w:val="1"/>
       <w:numFmt w:val="upperRoman"/>
+      <w:pStyle w:val="FB-TítuloPrincipal"/>
       <w:lvlText w:val="%1."/>
       <w:lvlJc w:val="right"/>
       <w:pPr>
         <w:ind w:left="720" w:hanging="360"/>
       </w:pPr>
+      <w:rPr>
+        <w:b/>
+        <w:bCs/>
+      </w:rPr>
     </w:lvl>
     <w:lvl w:ilvl="1" w:tplc="FFFFFFFF" w:tentative="1">
       <w:start w:val="1"/>
       <w:numFmt w:val="lowerLetter"/>
+      <w:pStyle w:val="FB-TítuloSecundário"/>
+      <w:suff w:val="space"/>
       <w:lvlText w:val="%2."/>
       <w:lvlJc w:val="left"/>
       <w:pPr>
-        <w:ind w:left="1440" w:hanging="360"/>
-      </w:pPr>
+        <w:ind w:left="567" w:firstLine="567"/>
+      </w:pPr>
+      <w:rPr>
+        <w:b/>
+        <w:bCs/>
+      </w:rPr>
     </w:lvl>
     <w:lvl w:ilvl="2" w:tplc="FFFFFFFF" w:tentative="1">
       <w:start w:val="1"/>
@@ -3860,7 +3871,10 @@
     <w:rPr>
       <w:rFonts w:ascii="Segoe UI Variable Text" w:hAnsi="Segoe UI Variable Text" w:eastAsia="Segoe UI Variable Text" w:cs="Segoe UI Variable Text"/>
       <w:b/>
+      <w:bCs/>
       <w:i w:val="0"/>
+      <w:caps/>
+      <w:smallCaps w:val="0"/>
       <w:sz w:val="24"/>
     </w:rPr>
   </w:style>
@@ -3878,7 +3892,10 @@
     <w:rPr>
       <w:rFonts w:ascii="Segoe UI Variable Text" w:hAnsi="Segoe UI Variable Text" w:eastAsia="Segoe UI Variable Text" w:cs="Segoe UI Variable Text"/>
       <w:b/>
+      <w:bCs/>
       <w:i w:val="0"/>
+      <w:caps/>
+      <w:smallCaps w:val="0"/>
       <w:sz w:val="24"/>
     </w:rPr>
   </w:style>
@@ -3954,6 +3971,7 @@
     <w:rPr>
       <w:rFonts w:ascii="Segoe UI Variable Text" w:hAnsi="Segoe UI Variable Text" w:eastAsia="Segoe UI Variable Text" w:cs="Segoe UI Variable Text"/>
       <w:b/>
+      <w:bCs/>
       <w:i w:val="0"/>
       <w:sz w:val="24"/>
     </w:rPr>
@@ -3966,7 +3984,7 @@
       <w:keepNext/>
       <w:widowControl w:val="0"/>
       <w:spacing w:before="720" w:after="240" w:line="300" w:lineRule="auto"/>
-      <w:ind w:left="567" w:hanging="283"/>
+      <w:ind w:left="567" w:firstLine="567"/>
       <w:jc w:val="left"/>
       <w:numPr>
         <w:ilvl w:val="1"/>
@@ -3976,6 +3994,7 @@
     <w:rPr>
       <w:rFonts w:ascii="Segoe UI Variable Text" w:hAnsi="Segoe UI Variable Text" w:eastAsia="Segoe UI Variable Text" w:cs="Segoe UI Variable Text"/>
       <w:b/>
+      <w:bCs/>
       <w:i w:val="0"/>
       <w:sz w:val="24"/>
     </w:rPr>

</xml_diff>